<commit_message>
paper: draft v2 clears the 6,000-word floor (6,486 counted from the generated tex) by adding the arc geometry to section 1 and the explicit under-determination count to section 2.3
</commit_message>
<xml_diff>
--- a/Claude Science Project Sep 29/paper/proposed-draft/proposed-draft-v2.docx
+++ b/Claude Science Project Sep 29/paper/proposed-draft/proposed-draft-v2.docx
@@ -95,6 +95,11 @@
     <w:p>
       <w:r>
         <w:t>The reconstruction problem has an unusual shape, and it is worth stating plainly before any method is described. The quantity of interest is a position on the seabed; the observations are a handful of scalar quantities measured over six hours by a communications link that was never intended to locate anything; and the last of those observations precedes the event of interest by some minutes. The published treatment by Davey et al. (2016), which is the authoritative Bayesian reconstruction and which defined the underwater search areas, estimates the aircraft state at the final transmission and stops there. Fuel is applied afterwards as a censor on trajectories rather than as a constraint within the likelihood; the two transmissions at 00:19Z are used unevenly, and the descent they may imply is not propagated; and the evidence that accumulated after the aircraft was lost, namely the drift of the recovered debris, the unsuccessful searches, the satellite imagery and the hydroacoustic record, is analysed against a reconstruction which those lines of evidence cannot in turn inform.</w:t>
+      </w:r>
+    </w:p>
+    <w:p>
+      <w:r>
+        <w:t>The geometry is worth stating in concrete terms, because it is what makes the problem hard and it is not conveyed by describing the data as sparse. Each handshake fixes the signal path length between the aircraft and the satellite, which places the aircraft on a locus on the ellipsoid of approximately constant elevation angle to a satellite nominally over the equator at 64.5°E. Over the southern Indian Ocean that locus runs approximately north-west to south-east, so a single measurement constrains position almost entirely in one direction and barely at all along the locus. Seven such measurements, taken roughly hourly, therefore constrain the radial geometry well and the along-arc position of the aircraft hardly at all, and it is the along-arc coordinate which determines where the aircraft ran out of fuel. The frequency offsets add a velocity constraint which breaks some of that degeneracy, but they do so through a term of a few hertz against an oscillator whose bias drifts by a comparable amount, so the information they carry is real but thin. The reconstruction problem is accordingly not one of fixing a position from redundant observations, which is the normal situation in navigation, but of propagating a dynamic model for six hours between observations that each constrain one direction.</w:t>
       </w:r>
     </w:p>
     <w:p>
@@ -832,6 +837,11 @@
     <w:p>
       <w:r>
         <w:t>The observations in Table 1 are few relative to the unknown they constrain. After 18:22Z the aircraft is observed at seven handshakes and at the two bursts of 00:19Z, which is of the order of twenty scalar quantities in total, of which several constrain the same geometry. A trajectory over six hours of flight, by contrast, requires of the order of a thousand parameters to specify even at a coarse time step, since heading, speed and altitude may each change at times which are themselves unknown. The system formed by equation (5) across all observation sets is therefore under-determined by two to three orders of magnitude, and no amount of care in the functional models alters that.</w:t>
+      </w:r>
+    </w:p>
+    <w:p>
+      <w:r>
+        <w:t>The count can be made explicit. After 18:22Z the observations comprise seven burst timing offsets, seven burst frequency offsets and the two bursts of 00:19Z, which is sixteen scalar quantities, to which the primary radar adds a well-determined position and track before 18:22Z but nothing afterwards. Against those sixteen, a trajectory specified at a one-minute step over the six hours from 18:22Z to 00:19Z requires of the order of 350 epochs, each carrying at least position, altitude, heading and speed, and the times at which heading or speed changed are themselves unknown. Even a parsimonious description in terms of a small number of straight legs and turns requires several tens of parameters, and the manoeuvre model admits far more. The ratio is therefore of the order of one observation per hundred unknowns at a coarse discretisation, and worse at any discretisation fine enough to represent a turn.</w:t>
       </w:r>
     </w:p>
     <w:p>

</xml_diff>

<commit_message>
paper: format audit against JON-RULES - fix five failures (keywords on manuscript, paragraph spacing, bold headings, missing reference list, no figures); embed five figures with captions below and alt text; recommendation 9 on greyscale survival
</commit_message>
<xml_diff>
--- a/Claude Science Project Sep 29/paper/proposed-draft/proposed-draft-v2.docx
+++ b/Claude Science Project Sep 29/paper/proposed-draft/proposed-draft-v2.docx
@@ -63,17 +63,6 @@
       </w:r>
       <w:r>
         <w:t>The loss of Malaysia Airlines flight MH370 in 2014 has been reconstructed by Bayesian estimation from satellite communication metadata, but published reconstructions end at the final transmission and treat fuel, the end of flight and the fate of the aircraft after impact outside the estimator. This study reports an integrated reconstruction carrying one probability distribution from the last radar fix to the seabed. A particle filter on the published measurement models is extended with fuel endurance and primary radar inside the likelihood, a waypoint route family and a modified sampler; its posterior at 00:11Z is handed to a stage simulating descent to water impact; and the impact distribution is then weighted by debris drift, unsuccessful seabed search, satellite imagery and hydroacoustic prediction on one shared set of impact samples. The waypoint route family carries 0.998 of the posterior weight, and unsuccessful search is the largest single factor on the impact distribution. No composed distribution is yet converged.</w:t>
-      </w:r>
-    </w:p>
-    <w:p>
-      <w:r>
-        <w:rPr>
-          <w:b/>
-        </w:rPr>
-        <w:t xml:space="preserve">Keywords.  </w:t>
-      </w:r>
-      <w:r>
-        <w:t>(Four, selected from the journal's list at submission.)</w:t>
       </w:r>
     </w:p>
     <w:p>
@@ -1770,6 +1759,70 @@
       </w:r>
     </w:p>
     <w:p>
+      <w:pPr>
+        <w:jc w:val="center"/>
+      </w:pPr>
+      <w:r>
+        <w:drawing>
+          <wp:inline xmlns:a="http://schemas.openxmlformats.org/drawingml/2006/main" xmlns:pic="http://schemas.openxmlformats.org/drawingml/2006/picture">
+            <wp:extent cx="5760000" cy="5138436"/>
+            <wp:docPr id="1" name="Picture 1"/>
+            <wp:cNvGraphicFramePr>
+              <a:graphicFrameLocks noChangeAspect="1"/>
+            </wp:cNvGraphicFramePr>
+            <a:graphic>
+              <a:graphicData uri="http://schemas.openxmlformats.org/drawingml/2006/picture">
+                <pic:pic>
+                  <pic:nvPicPr>
+                    <pic:cNvPr id="0" name="fig1-impact-latitude.png"/>
+                    <pic:cNvPicPr/>
+                  </pic:nvPicPr>
+                  <pic:blipFill>
+                    <a:blip r:embed="rId10"/>
+                    <a:stretch>
+                      <a:fillRect/>
+                    </a:stretch>
+                  </pic:blipFill>
+                  <pic:spPr>
+                    <a:xfrm>
+                      <a:off x="0" y="0"/>
+                      <a:ext cx="5760000" cy="5138436"/>
+                    </a:xfrm>
+                    <a:prstGeom prst="rect"/>
+                  </pic:spPr>
+                </pic:pic>
+              </a:graphicData>
+            </a:graphic>
+          </wp:inline>
+        </w:drawing>
+      </w:r>
+    </w:p>
+    <w:p>
+      <w:r>
+        <w:rPr>
+          <w:b w:val="0"/>
+          <w:i/>
+          <w:sz w:val="20"/>
+        </w:rPr>
+        <w:t>Figure 1.  Impact arc-latitude distribution. (a) With the drift term, for all six treatments of the 00:19Z observations. (b) After the search term. (c) Evidence added in turn under the first burst timing offset alone. (d) Per route stratum, with the equal-prior mixture. Dotted curves have too few effective candidates to be quotable. Core run I, composed pass 2; not converged; conditional on an equal family prior.</w:t>
+      </w:r>
+    </w:p>
+    <w:p>
+      <w:r>
+        <w:rPr>
+          <w:b w:val="0"/>
+          <w:i/>
+          <w:sz w:val="16"/>
+        </w:rPr>
+        <w:t>[Alt text for Figure 1, required at submission: Four line charts of probability density against impact latitude from 41 to 20 degrees south. All four peak between 38 and 36 degrees south. In panel b the peak moves north and flattens after the search term is applied. In panel d the free-flight curve lies about 0.3 degrees north of the mixture.]</w:t>
+      </w:r>
+    </w:p>
+    <w:p>
+      <w:r>
+        <w:t>Figure 1(a) shows the six treatments with the drift term applied, and Figure 1(b) the same six after the search term; the shift of the mode northward and the flattening of the distribution are visible in the second panel and are quantified in Section 3.6.</w:t>
+      </w:r>
+    </w:p>
+    <w:p>
       <w:r>
         <w:t>That cost determines what can be concluded. Before the search term is applied all six treatments are estimable, with effective sample sizes from 1,526 to 487,026. After it, the treatment using both frequency offsets as recorded falls to 393 effective candidates and the treatment correcting only the second offset to 610, both below the floor of 1,000; the treatment correcting both offsets remains just above it at 1,432. The two cells which correspond to the named hypotheses of Holland (2018) fall furthest: one from 275 effective candidates before composition to between 29 and 220 after it, the other from 833 to between 42 and 562.</w:t>
       </w:r>
@@ -1800,6 +1853,70 @@
       </w:r>
     </w:p>
     <w:p>
+      <w:pPr>
+        <w:jc w:val="center"/>
+      </w:pPr>
+      <w:r>
+        <w:drawing>
+          <wp:inline xmlns:a="http://schemas.openxmlformats.org/drawingml/2006/main" xmlns:pic="http://schemas.openxmlformats.org/drawingml/2006/picture">
+            <wp:extent cx="5760000" cy="3756176"/>
+            <wp:docPr id="2" name="Picture 2"/>
+            <wp:cNvGraphicFramePr>
+              <a:graphicFrameLocks noChangeAspect="1"/>
+            </wp:cNvGraphicFramePr>
+            <a:graphic>
+              <a:graphicData uri="http://schemas.openxmlformats.org/drawingml/2006/picture">
+                <pic:pic>
+                  <pic:nvPicPr>
+                    <pic:cNvPr id="0" name="fig3-ocean-models.png"/>
+                    <pic:cNvPicPr/>
+                  </pic:nvPicPr>
+                  <pic:blipFill>
+                    <a:blip r:embed="rId11"/>
+                    <a:stretch>
+                      <a:fillRect/>
+                    </a:stretch>
+                  </pic:blipFill>
+                  <pic:spPr>
+                    <a:xfrm>
+                      <a:off x="0" y="0"/>
+                      <a:ext cx="5760000" cy="3756176"/>
+                    </a:xfrm>
+                    <a:prstGeom prst="rect"/>
+                  </pic:spPr>
+                </pic:pic>
+              </a:graphicData>
+            </a:graphic>
+          </wp:inline>
+        </w:drawing>
+      </w:r>
+    </w:p>
+    <w:p>
+      <w:r>
+        <w:rPr>
+          <w:b w:val="0"/>
+          <w:i/>
+          <w:sz w:val="20"/>
+        </w:rPr>
+        <w:t>Figure 2.  Posterior probability of the first ocean product under each treatment of the 00:19Z observations and each composed product (a), and the impact arc-latitude distribution under each product separately with their equal-prior mixture (b). The dashed line in (a) marks the equal prior of one half. Not converged.</w:t>
+      </w:r>
+    </w:p>
+    <w:p>
+      <w:r>
+        <w:rPr>
+          <w:b w:val="0"/>
+          <w:i/>
+          <w:sz w:val="16"/>
+        </w:rPr>
+        <w:t>[Alt text for Figure 2, required at submission: Panel a is a dot plot of posterior probability between 0.3 and 0.9 against the six 00:19 treatments; all points lie between 0.45 and 0.63, close to the equal-prior line at 0.5. Panel b shows two single-product density curves about 0.2 degrees apart with their mixture between them.]</w:t>
+      </w:r>
+    </w:p>
+    <w:p>
+      <w:r>
+        <w:t>Figure 2 shows that the posterior weight of either product stays close to the equal prior of one half under every treatment and every composed product, and that the two products give impact distributions whose medians differ by about 0.2°.</w:t>
+      </w:r>
+    </w:p>
+    <w:p>
       <w:r>
         <w:t>This result carries the label that the absence of recoveries on the Western Australian coast is not modelled, because the beaching geometry covers only the coastlines on which items were in fact recovered. That omission removes a line of disconfirming evidence which would act on precisely the impact locations towards which the search term moves probability, and it is the most consequential single omission in the study.</w:t>
       </w:r>
@@ -1822,6 +1939,70 @@
     <w:p>
       <w:r>
         <w:t>The direction is the informative part. A search which found nothing does not concentrate a distribution; it removes the places which were searched and redistributes the probability to places which were not, and here those lie north of and outside the searched corridor. The term also acts on the end-of-flight families, reducing the posterior probability of the unpiloted family A1 from 0.17 to 0.08 while the two piloted families gain, which follows because A1 terminates closest to the seventh arc and therefore within the best-searched ground.</w:t>
+      </w:r>
+    </w:p>
+    <w:p>
+      <w:pPr>
+        <w:jc w:val="center"/>
+      </w:pPr>
+      <w:r>
+        <w:drawing>
+          <wp:inline xmlns:a="http://schemas.openxmlformats.org/drawingml/2006/main" xmlns:pic="http://schemas.openxmlformats.org/drawingml/2006/picture">
+            <wp:extent cx="5760000" cy="5320588"/>
+            <wp:docPr id="3" name="Picture 3"/>
+            <wp:cNvGraphicFramePr>
+              <a:graphicFrameLocks noChangeAspect="1"/>
+            </wp:cNvGraphicFramePr>
+            <a:graphic>
+              <a:graphicData uri="http://schemas.openxmlformats.org/drawingml/2006/picture">
+                <pic:pic>
+                  <pic:nvPicPr>
+                    <pic:cNvPr id="0" name="fig2-impact-regions.png"/>
+                    <pic:cNvPicPr/>
+                  </pic:nvPicPr>
+                  <pic:blipFill>
+                    <a:blip r:embed="rId12"/>
+                    <a:stretch>
+                      <a:fillRect/>
+                    </a:stretch>
+                  </pic:blipFill>
+                  <pic:spPr>
+                    <a:xfrm>
+                      <a:off x="0" y="0"/>
+                      <a:ext cx="5760000" cy="5320588"/>
+                    </a:xfrm>
+                    <a:prstGeom prst="rect"/>
+                  </pic:spPr>
+                </pic:pic>
+              </a:graphicData>
+            </a:graphic>
+          </wp:inline>
+        </w:drawing>
+      </w:r>
+    </w:p>
+    <w:p>
+      <w:r>
+        <w:rPr>
+          <w:b w:val="0"/>
+          <w:i/>
+          <w:sz w:val="20"/>
+        </w:rPr>
+        <w:t>Figure 3.  Highest-density impact regions under the first burst timing offset alone. Dark: 50% region. Light: 90% region. Cross: mean position. (a) Flight and end of flight only. (b) With the drift term. (c) With the drift and search terms. (d) Free-flight stratum alone, with drift. (e), (f) With the imagery term, conditional on the imaged objects being debris from this aircraft. Not converged: the two halves of the replicate set give areas differing by 13 to 41%.</w:t>
+      </w:r>
+    </w:p>
+    <w:p>
+      <w:r>
+        <w:rPr>
+          <w:b w:val="0"/>
+          <w:i/>
+          <w:sz w:val="16"/>
+        </w:rPr>
+        <w:t>[Alt text for Figure 3, required at submission: Six maps of latitude 27 to 41 degrees south against longitude 84 to 101 degrees east. The shaded region is a narrow band running south-west to north-east. It grows from panel a to panel c as the drift and search terms are added, and contracts markedly in panels e and f under the imagery hypothesis.]</w:t>
+      </w:r>
+    </w:p>
+    <w:p>
+      <w:r>
+        <w:t>Figure 3 shows the effect as regions rather than as marginals: the 50% region grows from 16,000km² to 51,000km² and the band extends north-east along the arc as the drift and search terms are added in turn.</w:t>
       </w:r>
     </w:p>
     <w:p>
@@ -2410,6 +2591,70 @@
       </w:r>
     </w:p>
     <w:p>
+      <w:pPr>
+        <w:jc w:val="center"/>
+      </w:pPr>
+      <w:r>
+        <w:drawing>
+          <wp:inline xmlns:a="http://schemas.openxmlformats.org/drawingml/2006/main" xmlns:pic="http://schemas.openxmlformats.org/drawingml/2006/picture">
+            <wp:extent cx="5760000" cy="5320588"/>
+            <wp:docPr id="4" name="Picture 4"/>
+            <wp:cNvGraphicFramePr>
+              <a:graphicFrameLocks noChangeAspect="1"/>
+            </wp:cNvGraphicFramePr>
+            <a:graphic>
+              <a:graphicData uri="http://schemas.openxmlformats.org/drawingml/2006/picture">
+                <pic:pic>
+                  <pic:nvPicPr>
+                    <pic:cNvPr id="0" name="fig5-seabed.png"/>
+                    <pic:cNvPicPr/>
+                  </pic:nvPicPr>
+                  <pic:blipFill>
+                    <a:blip r:embed="rId13"/>
+                    <a:stretch>
+                      <a:fillRect/>
+                    </a:stretch>
+                  </pic:blipFill>
+                  <pic:spPr>
+                    <a:xfrm>
+                      <a:off x="0" y="0"/>
+                      <a:ext cx="5760000" cy="5320588"/>
+                    </a:xfrm>
+                    <a:prstGeom prst="rect"/>
+                  </pic:spPr>
+                </pic:pic>
+              </a:graphicData>
+            </a:graphic>
+          </wp:inline>
+        </w:drawing>
+      </w:r>
+    </w:p>
+    <w:p>
+      <w:r>
+        <w:rPr>
+          <w:b w:val="0"/>
+          <w:i/>
+          <w:sz w:val="20"/>
+        </w:rPr>
+        <w:t>Figure 4.  Seabed regions for the wreckage field, with the 90% impact region overlaid as a dashed outline. Dark: 50% region. Light: 90% region. Upper row: 00:19Z observations held out. Lower row: first burst timing offset only. Columns: flight and end of flight; with the drift and search terms; with the imagery and search terms. Breakup in the air is not modelled for the field, and these regions are not a search plan.</w:t>
+      </w:r>
+    </w:p>
+    <w:p>
+      <w:r>
+        <w:rPr>
+          <w:b w:val="0"/>
+          <w:i/>
+          <w:sz w:val="16"/>
+        </w:rPr>
+        <w:t>[Alt text for Figure 4, required at submission: Six maps on the same axes as Figure 3, each showing a shaded seabed region with a dashed outline of the impact region almost coincident with it, confirming that the wreckage moves little during the descent through the water column.]</w:t>
+      </w:r>
+    </w:p>
+    <w:p>
+      <w:r>
+        <w:t>Figure 4 places the seabed regions against the impact regions they derive from; the dashed outline of the impact region is almost coincident with the seabed region in every panel.</w:t>
+      </w:r>
+    </w:p>
+    <w:p>
       <w:r>
         <w:t>The seabed distribution inherits the non-convergence of Section 3.1 and adds to it: the two halves of the replicate set differ by 22 to 43% in the area of the 90% region. It also carries two labels of its own. The seabed ensemble is re-weighted from the composed candidate weights rather than drawn from them, which is a partial treatment, and the breakup rows are settled from the intact impact point, so the extent of the wreckage field is a lower bound.</w:t>
       </w:r>
@@ -2452,6 +2697,70 @@
     <w:p>
       <w:r>
         <w:t>Effective sample size gives the other half of the accounting. Under the treatment using the first burst timing offset with the first frequency offset, the composition retains of the order of 6×10⁴ effective candidates after the flight and end-of-flight stages, 4×10⁴ after the drift term and 1×10⁴ after the search term, falling to a few thousand under the imagery hypothesis; that chain remains estimable throughout. The treatments using both frequency offsets do not, for the reasons given in Section 3.4. One line of evidence is therefore capable of rendering another unquotable, which is why the effective sample size is reported per factor beside every number rather than once for the composition as a whole.</w:t>
+      </w:r>
+    </w:p>
+    <w:p>
+      <w:pPr>
+        <w:jc w:val="center"/>
+      </w:pPr>
+      <w:r>
+        <w:drawing>
+          <wp:inline xmlns:a="http://schemas.openxmlformats.org/drawingml/2006/main" xmlns:pic="http://schemas.openxmlformats.org/drawingml/2006/picture">
+            <wp:extent cx="5760000" cy="4195767"/>
+            <wp:docPr id="5" name="Picture 5"/>
+            <wp:cNvGraphicFramePr>
+              <a:graphicFrameLocks noChangeAspect="1"/>
+            </wp:cNvGraphicFramePr>
+            <a:graphic>
+              <a:graphicData uri="http://schemas.openxmlformats.org/drawingml/2006/picture">
+                <pic:pic>
+                  <pic:nvPicPr>
+                    <pic:cNvPr id="0" name="fig4-coverage-ess.png"/>
+                    <pic:cNvPicPr/>
+                  </pic:nvPicPr>
+                  <pic:blipFill>
+                    <a:blip r:embed="rId14"/>
+                    <a:stretch>
+                      <a:fillRect/>
+                    </a:stretch>
+                  </pic:blipFill>
+                  <pic:spPr>
+                    <a:xfrm>
+                      <a:off x="0" y="0"/>
+                      <a:ext cx="5760000" cy="4195767"/>
+                    </a:xfrm>
+                    <a:prstGeom prst="rect"/>
+                  </pic:spPr>
+                </pic:pic>
+              </a:graphicData>
+            </a:graphic>
+          </wp:inline>
+        </w:drawing>
+      </w:r>
+    </w:p>
+    <w:p>
+      <w:r>
+        <w:rPr>
+          <w:b w:val="0"/>
+          <w:i/>
+          <w:sz w:val="20"/>
+        </w:rPr>
+        <w:t>Figure 5.  Effective sample size for every combination of 00:19Z data treatment, assumed cause of the power interruption and composed evidence product, for all end-of-flight families (a) and for the unpiloted family alone (b). Values below 1,000, outlined, are not estimable. Note the logarithmic scale.</w:t>
+      </w:r>
+    </w:p>
+    <w:p>
+      <w:r>
+        <w:rPr>
+          <w:b w:val="0"/>
+          <w:i/>
+          <w:sz w:val="16"/>
+        </w:rPr>
+        <w:t>[Alt text for Figure 5, required at submission: Two heat-map tables of effective sample size on a logarithmic scale from ten to one million. Values fall from several hundred thousand in the leftmost column to tens in the rightmost. Cells below one thousand, concentrated in the lower right of both panels, are outlined.]</w:t>
+      </w:r>
+    </w:p>
+    <w:p>
+      <w:r>
+        <w:t>Figure 5 gives the effective sample size of every cell, and is the diagnostic on which the estimability statements of Sections 3.4 and 3.9 rest: the values fall by four orders of magnitude from left to right across the composition.</w:t>
       </w:r>
     </w:p>
     <w:p>
@@ -2508,6 +2817,73 @@
     <w:p>
       <w:r>
         <w:t>Four lines of further work follow, ordered by how much each would change the answer rather than by how difficult each would be. First, a sampler aimed at the cells in which the end-of-flight families separate, which is the binding constraint on every number reported here and which Section 3.9 indicates will not be resolved by additional compute. Second, an end-of-flight model which reaches the rapid descents that the 00:19Z frequency offsets admit, together with a structural limit which excludes the impact speeds the present model allows, since 11 to 21% of the composed weight lies above 1.25 times the maximum operating speed before the search term is applied. Third, the Western Australian non-recovery term, which would act directly on the region towards which the search term moves probability. Fourth, absolute calibration of the hydroacoustic transmission loss together with characterisation of the band below 16Hz: of the four this is the only one which could convert an unused observation into a decisive one, and its value of information is correspondingly the largest.</w:t>
+      </w:r>
+    </w:p>
+    <w:p>
+      <w:r>
+        <w:rPr>
+          <w:b w:val="0"/>
+          <w:i w:val="0"/>
+          <w:caps/>
+          <w:sz w:val="24"/>
+        </w:rPr>
+        <w:t>REFERENCES</w:t>
+      </w:r>
+    </w:p>
+    <w:p>
+      <w:r>
+        <w:rPr>
+          <w:sz w:val="20"/>
+        </w:rPr>
+        <w:t>Ashton, C., Shuster Bruce, A., Colledge, G. and Dickinson, M. (2015). The Search for MH370. The Journal of Navigation, 68, 1-22. https://doi.org/10.1017/S037346331400068X.</w:t>
+      </w:r>
+    </w:p>
+    <w:p>
+      <w:r>
+        <w:rPr>
+          <w:sz w:val="20"/>
+        </w:rPr>
+        <w:t>Davey, S., Gordon, N., Holland, I., Rutten, M. and Williams, J. (2016). Bayesian Methods in the Search for MH370. Springer. https://doi.org/10.1007/978-981-10-0379-0.</w:t>
+      </w:r>
+    </w:p>
+    <w:p>
+      <w:r>
+        <w:rPr>
+          <w:sz w:val="20"/>
+        </w:rPr>
+        <w:t>Holland, I. D. (2018). MH370 Burst Frequency Offset Analysis and Implications on Descent Rate at End-of-Flight. IEEE Aerospace and Electronic Systems Magazine, 33, 24-33. https://doi.org/10.1109/MAES.2018.170048.</w:t>
+      </w:r>
+    </w:p>
+    <w:p>
+      <w:r>
+        <w:rPr>
+          <w:sz w:val="20"/>
+        </w:rPr>
+        <w:t>Lellouche, J.-M., Greiner, E., Bourdalle-Badie, R. and others (2021). The Copernicus Global 1/12 degree Oceanic and Sea Ice GLORYS12 Reanalysis. Frontiers in Earth Science, 9, 698876. https://doi.org/10.3389/feart.2021.698876. [AUTHOR LIST TO BE COMPLETED]</w:t>
+      </w:r>
+    </w:p>
+    <w:p>
+      <w:r>
+        <w:rPr>
+          <w:sz w:val="20"/>
+        </w:rPr>
+        <w:t>Minchin, S., Mueller, N., Lewis, A., Byrne, G. and Tran, M. (2017). Summary of imagery analyses for non-natural objects in support of the search for Flight MH370: Results from the analysis of imagery from the PLEIADES 1A satellite undertaken by Geoscience Australia. Geoscience Australia, Record 2017/013. https://doi.org/10.11636/record.2017.013.</w:t>
+      </w:r>
+    </w:p>
+    <w:p>
+      <w:r>
+        <w:rPr>
+          <w:sz w:val="20"/>
+        </w:rPr>
+        <w:t>Ng, H.-F., Zhong, Y., Groves, P. D. and Hsu, L.-T. (2024). Grid-based 3DMA GNSS with clustering and Doppler velocity. The Journal of Navigation, 77, 658-676. [VERIFY DOI]</w:t>
+      </w:r>
+    </w:p>
+    <w:p>
+      <w:r>
+        <w:rPr>
+          <w:sz w:val="20"/>
+        </w:rPr>
+        <w:t>Stone, L. D., Keller, C. M., Kratzke, T. M. and Strumpfer, J. P. (2014). Search for the Wreckage of Air France Flight AF 447. Statistical Science, 29, 69-80. https://doi.org/10.1214/13-STS420.</w:t>
       </w:r>
     </w:p>
     <w:p>
@@ -2949,7 +3325,7 @@
     <w:qFormat/>
     <w:rsid w:val="00FC693F"/>
     <w:pPr>
-      <w:spacing w:after="120" w:line="240" w:lineRule="auto"/>
+      <w:spacing w:after="0" w:before="0" w:line="240" w:lineRule="auto"/>
     </w:pPr>
     <w:rPr>
       <w:rFonts w:ascii="Times New Roman" w:hAnsi="Times New Roman"/>

</xml_diff>

<commit_message>
paper: add PAPER-BUDGET.md (section budget, ranked results in three tiers, 10-figure and 3-table list); fix duplicate section 3.7 numbering in draft v2
</commit_message>
<xml_diff>
--- a/Claude Science Project Sep 29/paper/proposed-draft/proposed-draft-v2.docx
+++ b/Claude Science Project Sep 29/paper/proposed-draft/proposed-draft-v2.docx
@@ -2582,7 +2582,7 @@
           <w:i/>
           <w:sz w:val="24"/>
         </w:rPr>
-        <w:t>3.7.  The seabed distribution</w:t>
+        <w:t>3.8.  The seabed distribution</w:t>
       </w:r>
     </w:p>
     <w:p>
@@ -2666,7 +2666,7 @@
           <w:i/>
           <w:sz w:val="24"/>
         </w:rPr>
-        <w:t>3.8.  Hydroacoustic prediction</w:t>
+        <w:t>3.9.  Hydroacoustic prediction</w:t>
       </w:r>
     </w:p>
     <w:p>
@@ -2686,7 +2686,7 @@
           <w:i/>
           <w:sz w:val="24"/>
         </w:rPr>
-        <w:t>3.9.  Evidence accounting</w:t>
+        <w:t>3.10.  Evidence accounting</w:t>
       </w:r>
     </w:p>
     <w:p>
@@ -2775,7 +2775,7 @@
           <w:i/>
           <w:sz w:val="24"/>
         </w:rPr>
-        <w:t>3.10.  Two negative results</w:t>
+        <w:t>3.11.  Two negative results</w:t>
       </w:r>
     </w:p>
     <w:p>

</xml_diff>

<commit_message>
paper: correct the radar epochs in draft v2 - 18:01:49Z is the end of the continuous track and the prior epoch, 18:22:12Z the last return; add the radar-in-likelihood statement to 2.2
</commit_message>
<xml_diff>
--- a/Claude Science Project Sep 29/paper/proposed-draft/proposed-draft-v2.docx
+++ b/Claude Science Project Sep 29/paper/proposed-draft/proposed-draft-v2.docx
@@ -62,7 +62,7 @@
         <w:t xml:space="preserve">Abstract.  </w:t>
       </w:r>
       <w:r>
-        <w:t>The loss of Malaysia Airlines flight MH370 in 2014 has been reconstructed by Bayesian estimation from satellite communication metadata, but published reconstructions end at the final transmission and treat fuel, the end of flight and the fate of the aircraft after impact outside the estimator. This study reports an integrated reconstruction carrying one probability distribution from the last radar fix to the seabed. A particle filter on the published measurement models is extended with fuel endurance and primary radar inside the likelihood, a waypoint route family and a modified sampler; its posterior at 00:11Z is handed to a stage simulating descent to water impact; and the impact distribution is then weighted by debris drift, unsuccessful seabed search, satellite imagery and hydroacoustic prediction on one shared set of impact samples. The waypoint route family carries 0.998 of the posterior weight, and unsuccessful search is the largest single factor on the impact distribution. No composed distribution is yet converged.</w:t>
+        <w:t>The loss of Malaysia Airlines flight MH370 in 2014 has been reconstructed by Bayesian estimation from satellite communication metadata, but published reconstructions end at the final transmission and treat fuel, the end of flight and the fate of the aircraft after impact outside the estimator. This study carries one probability distribution from the end of the continuous radar track to the seabed. A particle filter on the published measurement models is extended with fuel endurance and primary radar inside the likelihood, a waypoint route family and a modified sampler; its posterior at 00:11Z is handed to a stage simulating descent to water impact; and the impact distribution is then weighted by debris drift, unsuccessful seabed search, satellite imagery and hydroacoustic prediction on one shared set of impact samples. The waypoint route family carries 0.998 of the posterior weight, and unsuccessful search is the largest single factor on the impact distribution. No composed distribution is yet converged.</w:t>
       </w:r>
     </w:p>
     <w:p>
@@ -78,7 +78,7 @@
     </w:p>
     <w:p>
       <w:r>
-        <w:t>Malaysia Airlines flight MH370 departed Kuala Lumpur for Beijing on 7 March 2014 and did not arrive. The aircraft, a Boeing 777-200ER registered 9M-MRO, ceased secondary surveillance reporting at 17:21Z, was tracked on primary radar during a reversal back across the Malay peninsula until 18:22Z, and then flew for approximately six further hours while exchanging periodic handshakes with the Inmarsat 3-F1 geostationary satellite. Those handshakes carry two measured quantities, a burst timing offset which constrains the signal path length and therefore the aircraft's range from the satellite, and a burst frequency offset which constrains the Doppler shift and therefore the component of velocity along that path. After 18:22Z they are the only observations of the aircraft. Three underwater search operations between 2014 and 2025 have not located the principal wreckage.</w:t>
+        <w:t>Malaysia Airlines flight MH370 departed Kuala Lumpur for Beijing on 7 March 2014 and did not arrive. The aircraft, a Boeing 777-200ER registered 9M-MRO, ceased secondary surveillance reporting at 17:21Z, was tracked continuously on primary radar during a reversal back across the Malay peninsula until 18:01:49Z and on sparse military returns until 18:22:12Z, and then flew for approximately six further hours while exchanging periodic handshakes with the Inmarsat 3-F1 geostationary satellite. Those handshakes carry two measured quantities, a burst timing offset which constrains the signal path length and therefore the aircraft's range from the satellite, and a burst frequency offset which constrains the Doppler shift and therefore the component of velocity along that path. After 18:22Z they are the only observations of the aircraft. Three underwater search operations between 2014 and 2025 have not located the principal wreckage.</w:t>
       </w:r>
     </w:p>
     <w:p>
@@ -93,7 +93,7 @@
     </w:p>
     <w:p>
       <w:r>
-        <w:t>This study removes those three separations. One probability distribution is carried from the last radar fix at 18:01Z through to a distribution over resting places on the seabed, and every line of evidence acts on the same distribution. The published measurement models are retained and cited rather than re-derived, in the manner of Ng et al. (2024), and the account below describes only what was changed or added: fuel and endurance within the likelihood, primary radar within the likelihood, a waypoint route family, a modified sampler, an enumerated rather than a chosen treatment of the 00:19Z transmissions, a simulated end of flight, and the impact-level evidence terms.</w:t>
+        <w:t>This study removes those three separations. One probability distribution is carried from the end of the continuous primary radar track at 18:01:49Z through to a distribution over resting places on the seabed, and every line of evidence acts on the same distribution. The published measurement models are retained and cited rather than re-derived, in the manner of Ng et al. (2024), and the account below describes only what was changed or added: fuel and endurance within the likelihood, primary radar within the likelihood, a waypoint route family, a modified sampler, an enumerated rather than a chosen treatment of the 00:19Z transmissions, a simulated end of flight, and the impact-level evidence terms.</w:t>
       </w:r>
     </w:p>
     <w:p>
@@ -215,7 +215,7 @@
     </w:p>
     <w:p>
       <w:r>
-        <w:t>where X is the trajectory as a continuous function of time from the last radar fix at t₀ = 18:01Z to water impact, x(t) is the aircraft state vector at time t comprising position, altitude, three-dimensional velocity, mass and the commanded Mach number and track, g_imp is the deterministic map from a trajectory to the impact state it terminates in, and g_sea is the deterministic map from the impact state to the resting place, which is the descent through the water column. Equation (4) is the reason the estimation is organised as it is: estimate X and the rest follows, so the problem is one of trajectory estimation and not of locating a point.</w:t>
+        <w:t>where X is the trajectory as a continuous function of time from the end of the continuous primary radar track at t₀ = 18:01:49Z to water impact, x(t) is the aircraft state vector at time t comprising position, altitude, three-dimensional velocity, mass and the commanded Mach number and track, g_imp is the deterministic map from a trajectory to the impact state it terminates in, and g_sea is the deterministic map from the impact state to the resting place, which is the descent through the water column. Equation (4) is the reason the estimation is organised as it is: estimate X and the rest follows, so the problem is one of trajectory estimation and not of locating a point.</w:t>
       </w:r>
     </w:p>
     <w:p>
@@ -362,7 +362,7 @@
               <w:rPr>
                 <w:sz w:val="18"/>
               </w:rPr>
-              <w:t>Primary radar positions, 17:21Z to 18:22Z</w:t>
+              <w:t>Primary radar, continuous to 18:01:49Z then sparse to 18:22:12Z</w:t>
             </w:r>
           </w:p>
         </w:tc>
@@ -825,7 +825,7 @@
     </w:p>
     <w:p>
       <w:r>
-        <w:t>The observations in Table 1 are few relative to the unknown they constrain. After 18:22Z the aircraft is observed at seven handshakes and at the two bursts of 00:19Z, which is of the order of twenty scalar quantities in total, of which several constrain the same geometry. A trajectory over six hours of flight, by contrast, requires of the order of a thousand parameters to specify even at a coarse time step, since heading, speed and altitude may each change at times which are themselves unknown. The system formed by equation (5) across all observation sets is therefore under-determined by two to three orders of magnitude, and no amount of care in the functional models alters that.</w:t>
+        <w:t>The primary radar deserves a note, because its treatment is one of this study's departures. The continuous track ends at 18:01:49Z, which is where the prior is placed, following Davey et al. (2016), who place theirs at the penultimate radar point. Sparse military returns between 18:03Z and 18:15Z and a final return at 18:22:12Z were used only qualitatively by Davey et al. (2016, p.~21); here each is scored as a likelihood term, so the early trajectory is constrained by evidence rather than by a prior alone. The observations in Table 1 are few relative to the unknown they constrain. After 18:22Z the aircraft is observed at seven handshakes and at the two bursts of 00:19Z, which is of the order of twenty scalar quantities in total, of which several constrain the same geometry. A trajectory over six hours of flight, by contrast, requires of the order of a thousand parameters to specify even at a coarse time step, since heading, speed and altitude may each change at times which are themselves unknown. The system formed by equation (5) across all observation sets is therefore under-determined by two to three orders of magnitude, and no amount of care in the functional models alters that.</w:t>
       </w:r>
     </w:p>
     <w:p>
@@ -2801,7 +2801,7 @@
     </w:p>
     <w:p>
       <w:r>
-        <w:t>An integrated Bayesian reconstruction of the loss of MH370 has been built and run. One probability distribution is carried from the last radar fix at 18:01Z through the satellite handshakes to 00:11Z, through a simulated end of flight to water impact, and through the descent of the wreckage to the seabed, and is weighted by the drift of the recovered debris, by the unsuccessful searches, by satellite imagery and by hydroacoustic prediction on one shared set of impact samples.</w:t>
+        <w:t>An integrated Bayesian reconstruction of the loss of MH370 has been built and run. One probability distribution is carried from 18:01:49Z through the satellite handshakes to 00:11Z, through a simulated end of flight to water impact, and through the descent of the wreckage to the seabed, and is weighted by the drift of the recovered debris, by the unsuccessful searches, by satellite imagery and by hydroacoustic prediction on one shared set of impact samples.</w:t>
       </w:r>
     </w:p>
     <w:p>

</xml_diff>

<commit_message>
paper: restore the rebuilt draft (the radar paragraph move to 2.2 had been overwritten by a stale workspace copy)
</commit_message>
<xml_diff>
--- a/Claude Science Project Sep 29/paper/proposed-draft/proposed-draft-v2.docx
+++ b/Claude Science Project Sep 29/paper/proposed-draft/proposed-draft-v2.docx
@@ -815,6 +815,11 @@
     </w:p>
     <w:p>
       <w:r>
+        <w:t>The primary radar deserves a note, because its treatment is one of this study's departures. The continuous track ends at 18:01:49Z, which is where the prior is placed, following Davey et al. (2016), who place theirs at the penultimate radar point. Sparse military returns between 18:03Z and 18:15Z and a final return at 18:22:12Z were used only qualitatively by Davey et al. (2016, p.~21); here each is scored as a likelihood term, so the early trajectory is constrained by evidence rather than by a prior alone.</w:t>
+      </w:r>
+    </w:p>
+    <w:p>
+      <w:r>
         <w:rPr>
           <w:b w:val="0"/>
           <w:i/>
@@ -825,7 +830,7 @@
     </w:p>
     <w:p>
       <w:r>
-        <w:t>The primary radar deserves a note, because its treatment is one of this study's departures. The continuous track ends at 18:01:49Z, which is where the prior is placed, following Davey et al. (2016), who place theirs at the penultimate radar point. Sparse military returns between 18:03Z and 18:15Z and a final return at 18:22:12Z were used only qualitatively by Davey et al. (2016, p.~21); here each is scored as a likelihood term, so the early trajectory is constrained by evidence rather than by a prior alone. The observations in Table 1 are few relative to the unknown they constrain. After 18:22Z the aircraft is observed at seven handshakes and at the two bursts of 00:19Z, which is of the order of twenty scalar quantities in total, of which several constrain the same geometry. A trajectory over six hours of flight, by contrast, requires of the order of a thousand parameters to specify even at a coarse time step, since heading, speed and altitude may each change at times which are themselves unknown. The system formed by equation (5) across all observation sets is therefore under-determined by two to three orders of magnitude, and no amount of care in the functional models alters that.</w:t>
+        <w:t>The observations in Table 1 are few relative to the unknown they constrain. After 18:22Z the aircraft is observed at seven handshakes and at the two bursts of 00:19Z, which is of the order of twenty scalar quantities in total, of which several constrain the same geometry. A trajectory over six hours of flight, by contrast, requires of the order of a thousand parameters to specify even at a coarse time step, since heading, speed and altitude may each change at times which are themselves unknown. The system formed by equation (5) across all observation sets is therefore under-determined by two to three orders of magnitude, and no amount of care in the functional models alters that.</w:t>
       </w:r>
     </w:p>
     <w:p>

</xml_diff>

<commit_message>
paper: work order item 6 - Holland influence audit revised (8 entry points, table, 3 established facts); withdraw ln BF -0.34 +/- 0.10 and -1.68 as unsourced; resolve the '8-second window' as DST Group's inter-burst interval via ATSB 2017 p.101, not Boeing's; add the ATSB 25 NM corridor as the route by which the 00:19 bursts shaped the search; fix prohibited 'correction' wording at source in build_draft_v2.py and rebuild (0 occurrences, main text 6,603 w); RECOMMENDATIONS 11 and 12 posted
</commit_message>
<xml_diff>
--- a/Claude Science Project Sep 29/paper/proposed-draft/proposed-draft-v2.docx
+++ b/Claude Science Project Sep 29/paper/proposed-draft/proposed-draft-v2.docx
@@ -1057,7 +1057,7 @@
     </w:p>
     <w:p>
       <w:r>
-        <w:t>The 00:19Z observations are treated as an enumerated choice rather than as a decision. Six treatments D are defined, from holding them out entirely, through using the first burst timing offset alone, to using both frequency offsets with and without the oscillator start-up correction of Holland (2018); the anomalous second burst timing offset is used only in the reproduction stratum. Against these are set two causes C of the power interruption, fuel exhaustion followed by auxiliary power unit start, and an unattributed cause, combined per candidate as competing explanations:</w:t>
+        <w:t>The 00:19Z observations are treated as an enumerated choice rather than as a decision. Six treatments D are defined, from holding them out entirely, through using the first burst timing offset alone, to using both frequency offsets with and without the oscillator start-up transient bias of Holland (2018) added; the anomalous second burst timing offset is used only in the reproduction stratum. Against these are set two causes C of the power interruption, fuel exhaustion followed by auxiliary power unit start, and an unattributed cause, combined per candidate as competing explanations:</w:t>
       </w:r>
     </w:p>
     <w:p>
@@ -1760,7 +1760,7 @@
     </w:p>
     <w:p>
       <w:r>
-        <w:t>Across the six treatments the median of the drift-composed product moves by at most 0.43°, from −36.86° with the observations held out to −37.29° with both frequency offsets and the oscillator start-up correction applied. The treatments which use the second frequency offset produce the tightest distributions, with 90% regions of 90,000 to 100,000km² against 165,000km² for the first burst timing offset alone, but they do so at a severe cost in effective sample size.</w:t>
+        <w:t>Across the six treatments the median of the drift-composed product moves by at most 0.43°, from −36.86° with the observations held out to −37.29° with both frequency offsets and the Holland transient bias added. The treatments which use the second frequency offset produce the tightest distributions, with 90% regions of 90,000 to 100,000km² against 165,000km² for the first burst timing offset alone, but they do so at a severe cost in effective sample size.</w:t>
       </w:r>
     </w:p>
     <w:p>

</xml_diff>